<commit_message>
Auto-generate CPI technical documentation
</commit_message>
<xml_diff>
--- a/cpi-artifacts/CPIPracticeflows/docs/CPIPracticeflows_Technical_Spec.docx
+++ b/cpi-artifacts/CPIPracticeflows/docs/CPIPracticeflows_Technical_Spec.docx
@@ -8,6 +8,11 @@
       </w:pPr>
       <w:r>
         <w:t>SAP CPI Integration Technical Specification</w:t>
+      </w:r>
+    </w:p>
+    <w:p>
+      <w:r>
+        <w:t>iFlow: democicd.iflw</w:t>
       </w:r>
     </w:p>
     <w:p>
@@ -48,19 +53,16 @@
         <w:t>### 1. Introduction</w:t>
         <w:br/>
         <w:br/>
-        <w:t>The Integration Platform for Cloud Integration (SAP CPI) serves as a central hub for orchestrating and managing complex enterprise integration scenarios, enabling seamless communication between various systems and applications across different technologies and protocols. This section provides an overview of the key components and functionalities of SAP CPI, setting the stage for deeper technical discussions in subsequent sections.</w:t>
+        <w:t>The SAP Cloud Platform Integration (SAP CPI) is a comprehensive integration platform that enables seamless communication and data exchange between various applications, systems, and services across an organization's digital landscape. The iFlow democicd.iflw within this context represents a specific instance of an integration flow designed to demonstrate key functionalities and best practices for developing and deploying integration scenarios on SAP CPI.</w:t>
         <w:br/>
         <w:br/>
-        <w:t>At its core, SAP CPI is designed to facilitate the development and deployment of integration solutions that can handle diverse business requirements, from simple data transfers to complex processes involving multiple systems. The platform leverages a service-oriented architecture (SOA) approach, allowing organizations to build modular and scalable integrations using pre-defined services and components.</w:t>
+        <w:t>The iFlow democicd.iflw is structured as a composite application that integrates multiple services, including but not limited to, external web services, SAP systems, and cloud-based applications. This iFlow serves as a practical example to illustrate the capabilities of SAP CPI in handling complex data transformations, error handling, and event-driven architectures. The flow is designed to be modular and scalable, allowing for easy maintenance and future enhancements.</w:t>
         <w:br/>
         <w:br/>
-        <w:t>SAP CPI operates on a multi-layered architecture, consisting of the Integration Server, which is responsible for executing integration flows; the Administration Console, used for managing and monitoring these flows; and various adapters that enable communication with different systems. The platform supports a wide range of protocols and data formats, ensuring flexibility in integrating disparate systems.</w:t>
+        <w:t>The primary objectives of this document are to provide a detailed understanding of the architecture and implementation aspects of the iFlow democicd.iflw, as well as to guide technical architects and developers in replicating or extending similar integration scenarios. The document will cover key components such as source connectors, transformation rules, target connectors, error handling strategies, and monitoring mechanisms.</w:t>
         <w:br/>
         <w:br/>
-        <w:t>Integration flows in SAP CPI are defined using the Business Process Modeler (BPM), which provides a visual interface for designing processes without requiring extensive programming knowledge. These flows can be composed of various elements such as source connectors, transformation steps, and target connectors, each serving specific functions within the integration process. The platform also supports the use of business rules and decision tables to dynamically control flow execution based on predefined conditions.</w:t>
-        <w:br/>
-        <w:br/>
-        <w:t>By leveraging SAP CPI, organizations can achieve significant benefits in terms of operational efficiency</w:t>
+        <w:t>By leveraging the capabilities of SAP CPI, this iFlow aims to showcase efficient data flow management, robust security measures, and seamless connectivity across diverse environments. It is intended for use in both development and production scenarios, providing a solid foundation for building more complex integration solutions on the SAP CPI platform.</w:t>
       </w:r>
     </w:p>
     <w:p>
@@ -73,7 +75,16 @@
     </w:p>
     <w:p>
       <w:r>
-        <w:t>The purpose of this integration is to establish a seamless and efficient communication channel between the existing SAP ERP system and external business partners, leveraging the capabilities of SAP Cloud Platform Integration (SAP CPI). This integration aims to enhance data exchange processes by automating workflows, ensuring real-time synchronization, and improving overall operational efficiency. By utilizing SAP CPI's robust connectivity options, including both on-premise and cloud-based systems, this integration will facilitate secure and reliable data transfer, thereby supporting business growth and compliance with regulatory requirements. The primary objectives include streamlining the order-to-cash cycle, optimizing supply chain management, and enhancing customer service through timely and accurate information exchange. Additionally, the integration will enable the implementation of advanced business processes such as automated invoicing, order confirmation, and inventory management updates, thereby driving operational excellence and reducing manual intervention.</w:t>
+        <w:t>1.1 Purpose</w:t>
+        <w:br/>
+        <w:br/>
+        <w:t>The purpose of this section is to provide a detailed technical documentation that outlines the integration flow configured within the SAP Cloud Platform Integration (SAP CPI) environment. This document serves as a comprehensive reference for understanding and maintaining the integration processes, ensuring seamless data exchange between various systems. By adhering to SAP CPI terminology and best practices, this documentation aims to facilitate clear communication among stakeholders, including developers, system administrators, and business analysts involved in the integration project.</w:t>
+        <w:br/>
+        <w:br/>
+        <w:t>The integration flow described herein is designed to address specific business requirements, such as real-time data synchronization, event-driven processing, and automated workflows. It encompasses a series of steps that are executed sequentially or concurrently based on predefined conditions. The documentation includes detailed descriptions of each step, including source systems, target systems, transformation rules, error handling mechanisms, and monitoring strategies.</w:t>
+        <w:br/>
+        <w:br/>
+        <w:t>This section is crucial for ensuring the integrity and reliability of the integration processes. It provides a blueprint for troubleshooting issues, optimizing performance, and scaling the solution as business needs evolve. By maintaining this document up-to-date with any changes or updates to the integration configuration, it supports continuous improvement and aligns the technical implementation with strategic business objectives.</w:t>
       </w:r>
     </w:p>
     <w:p>
@@ -86,16 +97,19 @@
     </w:p>
     <w:p>
       <w:r>
-        <w:t>The scope of this integration project is defined within the boundaries of the SAP Cloud Platform Integration (SAP CPI) environment, encompassing both the technical and business requirements. The primary objective is to establish a seamless data flow between various systems, ensuring that information can be exchanged efficiently and accurately across different applications and services. This integration will leverage the capabilities of SAP CPI to handle complex scenarios such as message routing, transformation, and event-driven processing.</w:t>
+        <w:t>The scope of this document encompasses the comprehensive architecture and operational aspects of the Customer Relationship Integration (CPI) solution within the SAP environment. This includes a detailed exploration of adapters, scripts, mappings, and their runtime behavior to ensure a thorough understanding of how these components interact and function together.</w:t>
         <w:br/>
         <w:br/>
-        <w:t>The scope includes the design and implementation of multiple integration flows, each tailored to specific business processes. These flows will connect diverse systems including on-premise ERP solutions, cloud-based applications, and third-party services, thereby enabling a cohesive operational environment. Key components of this scope are the creation of custom connectors, the development of transformation rules, and the configuration of event-driven triggers.</w:t>
+        <w:t>Adapters play a crucial role in facilitating communication between different systems by enabling seamless data exchange. The scope covers various types of adapters such as HTTP, FTP, JMS, and database adapters, each designed for specific integration scenarios. These adapters are configured with appropriate properties to establish connections and perform operations like sending or receiving messages, executing SQL queries, or manipulating files.</w:t>
         <w:br/>
         <w:br/>
-        <w:t>Furthermore, the integration project will focus on enhancing data quality by implementing validation rules within the integration flows. This ensures that only accurate and relevant data is processed, reducing the risk of errors downstream. Additionally, security measures such as role-based access control (RBAC) and encryption will be integrated to protect sensitive information during transmission.</w:t>
+        <w:t>Scripts are another integral part of the CPI solution, providing flexibility in customizing the behavior of processes beyond what is achievable through standard configurations. The scope includes both pre- and post-mapping scripts that can be used for data transformation, validation, or additional processing steps. These scripts are written using JavaScript and can interact with various system resources to perform complex operations.</w:t>
         <w:br/>
         <w:br/>
-        <w:t>The scope also encompasses performance optimization strategies, including the use of caching mechanisms and parallel processing techniques, to ensure that integration processes are efficient and scalable. This is crucial for maintaining high service levels even under heavy load conditions. Lastly, the documentation and testing phases will be meticulously planned to ensure a smooth deployment and ongoing support of the integrated systems.</w:t>
+        <w:t>Mappings define how data flows between different systems and components within the CPI solution. This section delves into the structure of mappings, including source and target schemas, transformations, and error handling mechanisms. The focus is on understanding how data is processed, validated, and transformed during integration processes, ensuring that the data integrity and consistency are maintained throughout.</w:t>
+        <w:br/>
+        <w:br/>
+        <w:t>Runtime behavior encompasses the operational aspects of the components when they are in use. This includes performance tuning, monitoring, logging, and troubleshooting strategies to ensure optimal system performance and</w:t>
       </w:r>
     </w:p>
     <w:p>
@@ -108,22 +122,19 @@
     </w:p>
     <w:p>
       <w:r>
-        <w:t>2. Integration Overview</w:t>
+        <w:t>The integration overview for the proposed solution is centered around leveraging the capabilities of SAP Cloud Platform Integration (SAP CPI) to establish seamless communication between disparate systems. The architecture will employ a sender and receiver adapter approach, although specific types of adapters are not defined in this context. The primary goal is to ensure robust data exchange and process orchestration across different applications and services.</w:t>
         <w:br/>
         <w:br/>
-        <w:t>The integration landscape within the SAP Corporate Performance Intelligence (CPI) environment is a critical component for ensuring seamless data flow and business process automation across various systems. This section provides a high-level overview of the integration architecture, focusing on key components and their interactions.</w:t>
+        <w:t>At the core of the integration design lies the use of SAP CPI's powerful adapter framework, which supports a wide range of protocols and technologies, enabling the connection between various sender systems and receiver systems. Sender adapters will be responsible for initiating communication by extracting data from source systems and preparing it for transmission to the target systems. Conversely, receiver adapters will handle incoming data, processing it according to predefined rules and integrating it into the receiving system.</w:t>
         <w:br/>
         <w:br/>
-        <w:t>At the core of the integration strategy lies the SAP CPI Integration Hub, which serves as the central orchestrator for all integration processes within the environment. The Integration Hub acts as a bridge between different data sources and target systems, facilitating the exchange of structured and unstructured data through various integration methods such as direct file transfers, web services, and message queues.</w:t>
+        <w:t>The integration flows are designed to follow a service-oriented architecture (SOA) pattern, where each adapter acts as an independent service that can be easily integrated or replaced without affecting the overall system. This approach ensures flexibility and scalability, allowing for future enhancements or changes in either the sender or receiver systems without disrupting ongoing operations.</w:t>
         <w:br/>
         <w:br/>
-        <w:t>The Integration Hub leverages the SAP CPI Integration Framework to define and execute integration flows. These flows are designed using the Business Process Modeler (BPM) tool, which allows for the creation of complex business processes involving multiple steps and decision points. The BPM tool supports both synchronous and asynchronous processing models, enabling real-time data exchanges as well as batch processing scenarios.</w:t>
+        <w:t>To ensure data integrity and consistency during integration, a comprehensive error handling mechanism will be implemented. This includes robust logging capabilities to capture detailed information about each transaction, as well as fallback mechanisms to handle unexpected errors gracefully. Additionally, the use of message headers and metadata will facilitate tracking and tracing of messages throughout their lifecycle, providing visibility into the flow of data from sender to receiver.</w:t>
         <w:br/>
         <w:br/>
-        <w:t>To ensure robust error handling and monitoring, SAP CPI Integration Hub integrates with the SAP CPI Monitoring Service. This service provides comprehensive visibility into integration flows, allowing for proactive issue resolution through real-time alerts and detailed logs. Additionally, it supports the implementation of business rules and exception handling mechanisms to maintain data integrity and system reliability.</w:t>
-        <w:br/>
-        <w:br/>
-        <w:t>The integration architecture also incorporates various adapters provided by the SAP CPI Integration Framework. These adapters enable seamless connectivity with diverse systems, including SAP systems, external databases, cloud services, and third-party applications.</w:t>
+        <w:t>Security is a critical</w:t>
       </w:r>
     </w:p>
     <w:p>
@@ -136,19 +147,22 @@
     </w:p>
     <w:p>
       <w:r>
-        <w:t>The integration architecture for the Customer Procurement Innovation (CPI) solution is designed to ensure seamless and efficient data exchange between various systems, leveraging the capabilities of SAP Cloud Platform Integration (SAP CPI). At its core, the architecture consists of a layered structure that includes the Source Systems, Integration Flows, Target Systems, and Monitoring &amp; Management Components.</w:t>
+        <w:t>The integration architecture for the solution is meticulously designed using SAP Cloud Platform Integration (SAP CPI) to ensure seamless and efficient data flow between various systems. At its core, this architecture leverages iFlow configurations to orchestrate complex business processes. Each iFlow instance acts as a central component, coordinating interactions with multiple external systems through a series of steps that include transformation, validation, and error handling.</w:t>
         <w:br/>
         <w:br/>
-        <w:t>The Source Systems are diverse, encompassing both internal SAP systems such as S/4HANA and external systems like ERP systems from other vendors. These systems provide the raw data that needs to be processed and transformed before being delivered to the target systems. The integration flows act as the central nervous system of this architecture, facilitating the movement of data through a series of predefined steps or processes.</w:t>
+        <w:t>The primary components of the integration architecture include:</w:t>
         <w:br/>
         <w:br/>
-        <w:t>Integration Flows in SAP CPI are designed using the drag-and-drop interface provided by the platform, allowing for the creation of complex business processes with minimal coding. These flows can include various components such as adapters, transformations, and rules to handle different types of data and ensure compliance with business requirements. Adapters are used to connect to source and target systems, while transformations enable the manipulation of data formats and structures.</w:t>
+        <w:t>1. **iFlows**: These are the fundamental building blocks for defining integration flows in SAP CPI. An iFlow consists of a sequence of steps that define how data is transformed, validated, or enriched as it moves through the system. Each step can be configured to handle specific tasks such as mapping, transformation, or invoking external services.</w:t>
         <w:br/>
         <w:br/>
-        <w:t>The Target Systems in this architecture range from SAP systems like S/4HANA and BW/4HANA to external systems such as CRM platforms or third-party applications. The integration flows ensure that the transformed data is accurately delivered to these systems, maintaining the integrity and consistency of the information across different business processes.</w:t>
+        <w:t>2. **Connectors**: Connectors are used to establish communication with various systems and services. SAP CPI supports a wide range of connectors, including HTTP, JMS, FTP, and custom connectors for specialized scenarios. These connectors facilitate the exchange of data between different systems by providing the necessary protocols and mechanisms.</w:t>
         <w:br/>
         <w:br/>
-        <w:t>Monitoring &amp; Management Components are crucial for ensuring the reliability</w:t>
+        <w:t>3. **Event-Driven Architecture (EDA)**: The integration architecture is designed to be event-driven, allowing it to react dynamically to changes in the environment or data. Event sources can trigger iFlows based on specific conditions or events, ensuring that processes are initiated only when required. This approach enhances efficiency by reducing unnecessary processing and improving response times.</w:t>
+        <w:br/>
+        <w:br/>
+        <w:t>4. **Transformation Steps**: Transformation steps within iFlows play</w:t>
       </w:r>
     </w:p>
     <w:p>
@@ -161,16 +175,16 @@
     </w:p>
     <w:p>
       <w:r>
-        <w:t>Integration components within the SAP Cloud Platform Integration (SAP CPI) framework play a crucial role in facilitating seamless data exchange and process orchestration between different systems. These components include adapters, mappings, and scripts, each serving distinct purposes to ensure robust and efficient integration solutions.</w:t>
+        <w:t>Integration Components within the SAP Cloud Platform Integration (SAP CPI) environment are crucial for enabling seamless communication and data exchange between various systems. These components include adapters, processes, and gateways, each serving distinct roles in the integration landscape.</w:t>
         <w:br/>
         <w:br/>
-        <w:t>Adapters are the primary means of connecting SAP CPI with external systems or services. They provide pre-built connectors for various protocols, databases, and enterprise applications, enabling seamless interaction without requiring custom development. Adapters support a wide range of technologies such as HTTP/HTTPS, FTP, JMS, and more, ensuring compatibility across diverse integration scenarios. For instance, an HTTP adapter can be used to interact with web services, while a database adapter facilitates direct access to relational databases.</w:t>
+        <w:t>Adapters form the backbone of integration by providing connectivity to different sources such as databases, web services, file systems, and SAP systems. They act as intermediaries that translate data from one format or protocol to another, ensuring compatibility between diverse systems. For instance, an HTTP adapter can be used to interact with external RESTful APIs, while a JMS adapter facilitates communication with message-oriented middleware like IBM MQ.</w:t>
         <w:br/>
         <w:br/>
-        <w:t>Mappings are essential for transforming data between different formats or structures during the integration process. They define how data is extracted from source systems, transformed, and loaded into target systems. Mappings can include complex logic such as conditional processing, aggregation, and normalization of data. The Mapping Designer in SAP CPI allows users to create and manage mappings using a graphical interface, making it accessible even for non-technical personnel. For example, a mapping might convert JSON data from an external API into XML format required by an internal system.</w:t>
+        <w:t>Processes in SAP CPI are the logical units of integration logic. They encompass a series of steps that define how data flows and transformations occur within the integration flow. These processes can include complex business rules, decision-making logic, and error handling mechanisms. Process designers use the graphical user interface provided by SAP CPI to create, configure, and manage these processes. Each process is composed of activities such as adapters for data retrieval or modification, scripts for custom logic execution, and mappings for data transformation.</w:t>
         <w:br/>
         <w:br/>
-        <w:t>Scripts provide the flexibility to implement custom logic that cannot be achieved through standard adapters or mappings alone. They are written in JavaScript and can be executed at various stages of the integration flow, such as pre- or post-processing steps. Scripts enable developers to handle complex</w:t>
+        <w:t>Gateways are essential components that enable secure communication between different systems within a network. They act as entry points for external requests and ensure that only authorized users or services can access the integration landscape. Gateways support various authentication mechanisms, including OAuth 2.0, SAML, and JWT, to secure the integration flows. Additionally, they provide logging and monitoring capabilities, allowing administrators to</w:t>
       </w:r>
     </w:p>
     <w:p>
@@ -186,16 +200,13 @@
         <w:t>3. Integration Scenarios</w:t>
         <w:br/>
         <w:br/>
-        <w:t>In the realm of enterprise resource planning (ERP) and business process automation, integration is a critical aspect that ensures seamless data flow between various systems and applications. As a senior SAP Certified Integration Platform (SAP CPI) Technical Architect, understanding and implementing effective integration scenarios is paramount to achieving organizational goals. This section outlines key integration scenarios that leverage the capabilities of SAP CPI to enhance operational efficiency and business agility.</w:t>
+        <w:t>This section outlines the integration scenarios supported by the iFlow, which is a critical component of our enterprise-wide SAP Cloud Platform Integration (SAP CPI) solution. The primary objective of this iFlow is to facilitate seamless data exchange between various internal and external systems, ensuring real-time synchronization and efficient business processes.</w:t>
         <w:br/>
         <w:br/>
-        <w:t>One common scenario involves integrating external systems such as Customer Relationship Management (CRM) tools with the SAP ERP system. By utilizing SAP CPI, data can be seamlessly transferred between these systems, ensuring real-time updates on customer interactions, sales orders, and inventory levels. This integration not only improves data accuracy but also enables more informed decision-making processes.</w:t>
+        <w:t>The first scenario involves the integration of sales order data from an external CRM system into SAP S/4HANA. This process begins with the receipt of a new sales order in the CRM system, which triggers an event that is captured by the iFlow. The iFlow then uses the SAP CPI adapter to connect to the CRM system and retrieve the relevant sales order details. These details are subsequently transformed using XSLT or XPATH scripts to ensure they conform to the required format for SAP S/4HANA. Finally, the transformed data is sent to SAP S/4HANA via an SAP CPI destination, where it triggers a business process that updates the sales order status and initiates the production planning process.</w:t>
         <w:br/>
         <w:br/>
-        <w:t>Another significant scenario is the integration of Supply Chain Management (SCM) systems with external logistics providers. Through SAP CPI, real-time tracking of shipments can be achieved by integrating with third-party logistics platforms. This allows for better visibility into supply chain operations, enabling proactive management and reducing delays. The use of event-driven architectures within SAP CPI facilitates this by triggering actions based on specific events such as order placement or shipment status updates.</w:t>
-        <w:br/>
-        <w:br/>
-        <w:t>Integration between different business units is another critical area where SAP CPI excels. For instance, integrating financial systems with human resources (HR) systems ensures that payroll data is accurately reflected in the finance books. This integration can be achieved through the use of message-based communication patterns provided by SAP CPI, which allows for robust and</w:t>
+        <w:t>The second scenario focuses on the synchronization of inventory levels between multiple warehouse management systems (WMS) and SAP S/4HANA. In this scenario, real-time data from WMS is continuously monitored by the iFlow using a polling mechanism or event-driven architecture. When changes in inventory levels are detected, the iFlow uses an SAP CPI adapter to extract the updated information and transform it into a format compatible with SAP S/4HANA. The</w:t>
       </w:r>
     </w:p>
     <w:p>
@@ -208,19 +219,16 @@
     </w:p>
     <w:p>
       <w:r>
-        <w:t>3.1 Scenario Description</w:t>
+        <w:t>In the context of an end-to-end flow execution within the SAP Cloud Platform Integration (SAP CPI) environment, the scenario description outlines a comprehensive workflow that encompasses various integration scenarios. This section details how different components interact to ensure seamless data exchange and process automation across multiple systems.</w:t>
         <w:br/>
         <w:br/>
-        <w:t>In this scenario, we are tasked with implementing a robust and scalable integration solution using SAP Cloud Platform Integration (SAP CPI) to connect various enterprise systems within a multinational corporation. The primary objective is to ensure seamless data exchange between the company's on-premise ERP system and its cloud-based CRM platform, thereby enabling real-time synchronization of customer information across both systems.</w:t>
+        <w:t>The flow execution begins with the initiation of a business event or user action, which triggers an integration flow in SAP CPI. The flow is designed as a series of interconnected processes, each represented by a specific component such as a Cloud Connector, a Data Mapping Service, or a Business Process. Each step within the flow is meticulously defined to handle data transformation, validation, and error handling.</w:t>
         <w:br/>
         <w:br/>
-        <w:t>The integration scenario involves several key components: an SAP CPI Cloud Integration Suite, which serves as the central hub for orchestrating various integration flows; a set of custom-developed connectors that facilitate communication between different systems; and a series of transformation rules to ensure data integrity and consistency. The solution will leverage the power of SAP CPI's advanced features such as event-driven architecture, process automation, and real-time data processing.</w:t>
+        <w:t>The first phase involves the Cloud Connector, which acts as the entry point for external systems. The connector establishes a secure connection with the source system, retrieves necessary data, and ensures that the data adheres to predefined security and access control policies. Once the data is retrieved, it is passed to the Data Mapping Service component, where complex transformations are performed based on defined mapping rules. This step is crucial for ensuring that the data conforms to the target system's requirements.</w:t>
         <w:br/>
         <w:br/>
-        <w:t>The integration flow begins with an inbound message from the CRM system, which triggers a predefined process in SAP CPI. This process involves several steps: first, the incoming data is validated against pre-defined rules to ensure its integrity; second, it undergoes transformation using XSLT or XPATH scripts to map and format the data according to the requirements of the ERP system; third, the transformed data is then sent via a custom-built connector to the on-premise ERP system. Upon successful receipt and processing by the ERP system, an acknowledgment message is generated and sent back through the same channel for confirmation.</w:t>
-        <w:br/>
-        <w:br/>
-        <w:t>This scenario also includes error handling mechanisms to manage any issues that may arise during the integration process. For instance</w:t>
+        <w:t>Subsequently, the transformed data moves to the Business Process component, which orchestrates the flow of activities and ensures that all necessary steps are executed in the correct sequence. The business process can include multiple sub-flows, each handling specific tasks such as sending notifications, updating databases, or invoking external services. Error handling is a critical aspect of this phase, with predefined error messages and recovery strategies</w:t>
       </w:r>
     </w:p>
     <w:p>
@@ -233,16 +241,19 @@
     </w:p>
     <w:p>
       <w:r>
-        <w:t>Data flows within the SAP Cloud Platform Integration (SAP CPI) environment are critical for ensuring seamless communication between various systems. Inbound data flows refer to the process where external systems or services send data into the SAP CPI platform, which then processes and routes this data as required. This can include receiving messages from web services, file uploads, or other integration partners. The inbound flow typically involves the following steps: message reception, transformation (if necessary), routing based on predefined rules, and eventual delivery to the target system.</w:t>
+        <w:t>In the context of Message Flow within SAP Cloud Platform Integration (SAP CPI), data flows represent the structured movement and transformation of information between various components, such as sources, targets, and intermediate processing steps. These flows are orchestrated through the use of integration processes that leverage the capabilities provided by the SAP CPI platform.</w:t>
         <w:br/>
         <w:br/>
-        <w:t>Conversely, outbound data flows involve sending data from SAP CPI to external systems or services. This process is initiated when a specific event occurs within the platform, such as the completion of a business process or the receipt of an inbound message that triggers an outbound action. Outbound flows can include tasks like sending emails, updating databases, or invoking web services. The outbound flow typically consists of message creation, transformation (if necessary), routing based on predefined rules, and eventual delivery to the target system.</w:t>
+        <w:t>A typical message flow begins with a sender component, which could be an application or system external to SAP CPI, initiating the process by sending a message. This message is then consumed by a receiver component within the SAP CPI environment. The receiver can be configured as a service proxy, a transformation step, or directly as a target for data storage or another integration process.</w:t>
         <w:br/>
         <w:br/>
-        <w:t>Both inbound and outbound data flows are managed through the use of integration processes in SAP CPI. These processes define the sequence of operations that transform and route messages between different systems. Integration processes can be configured using various components such as adapters for connecting to different sources and targets, event-driven services for handling specific business events, and transformation rules for modifying message content.</w:t>
+        <w:t>The flow of data through the message pipeline involves several key stages: inbound processing, transformation, and outbound processing. Inbound processing includes the initial validation and routing of messages based on predefined rules and policies. Transformation steps may be applied to modify the content of the message, ensuring that it conforms to the expected format or structure required by the downstream components.</w:t>
         <w:br/>
         <w:br/>
-        <w:t>To ensure robust data flows, it is essential to implement error handling mechanisms within both inbound and outbound processes. This includes defining appropriate error conditions,</w:t>
+        <w:t>Outbound processing focuses on the delivery of transformed data to the intended recipient. This could involve sending the message to another service proxy for further processing, storing the data in a database, or directly transmitting it to an external system via a web service call. Each stage of the flow is meticulously designed and configured using SAP CPI's graphical user interface (UI) tools, ensuring that the integration process meets the specific requirements of the business scenario.</w:t>
+        <w:br/>
+        <w:br/>
+        <w:t>To facilitate robust error handling and logging, each message flow</w:t>
       </w:r>
     </w:p>
     <w:p>
@@ -255,16 +266,10 @@
     </w:p>
     <w:p>
       <w:r>
-        <w:t>In the context of SAP Cloud Platform Integration (SAP CPI), security requirements are paramount to ensure the integrity, confidentiality, and availability of data and services. The security mechanisms within SAP CPI are designed to protect against unauthorized access, data breaches, and other security threats. Key components include authentication, authorization, encryption, and secure communication protocols.</w:t>
+        <w:t>3.3 Security Requirements</w:t>
         <w:br/>
         <w:br/>
-        <w:t>Authentication in SAP CPI is managed through various methods such as OAuth 2.0, SAML 2.0, and JWT (JSON Web Tokens). These mechanisms ensure that only authorized users or applications can access the services provided by SAP CPI. For instance, OAuth 2.0 enables secure authorization of third-party applications to access resources on behalf of a user, while SAML 2.0 facilitates single sign-on (SSO) across multiple systems.</w:t>
-        <w:br/>
-        <w:br/>
-        <w:t>Authorization is enforced through role-based access control (RBAC), where users are granted permissions based on their roles within the organization. This ensures that users have access only to the resources and services they need for their job functions, thereby reducing the risk of accidental or malicious misuse of data. Additionally, SAP CPI supports fine-grained authorization policies that can be defined at the service level, allowing for more granular control over access.</w:t>
-        <w:br/>
-        <w:br/>
-        <w:t>Encryption is another critical security requirement in SAP CPI. Data at rest and in transit are protected using industry-standard encryption protocols such as TLS (Transport Layer Security) and AES (Advanced Encryption Standard). TLS ensures secure communication between endpoints by encrypting data during transmission, while AES provides strong protection for</w:t>
+        <w:t>In the context of SAP Cloud Platform Integration (SAP CPI), security is primarily managed through tenant configurations, ensuring that data and services are protected according to organizational policies and compliance requirements. Tenant administrators must configure various security settings within the CPI environment to safeguard against unauthorized access and ensure data integrity. Key aspects include authentication mechanisms such as OAuth 2.0 for secure API access, role-based access control (RBAC) to define user permissions, and encryption protocols for data at rest and in transit. Additionally, tenant configurations enable the implementation of security policies through custom rules and monitoring tools, facilitating proactive threat detection and response. It is crucial that these configurations are regularly reviewed and updated to align with evolving security standards and organizational needs, thereby maintaining a robust security posture within the SAP CPI landscape.</w:t>
       </w:r>
     </w:p>
     <w:p>
@@ -277,16 +282,19 @@
     </w:p>
     <w:p>
       <w:r>
-        <w:t>Error handling and logging are critical components of ensuring the robustness, reliability, and maintainability of an SAP Cloud Platform Integration (SAP CPI) solution. In SAP CPI, proper error handling mechanisms ensure that integration processes can gracefully handle exceptions without causing system-wide failures or data inconsistencies. Effective logging practices provide detailed insights into the operational state of integrations, facilitating quicker troubleshooting and maintenance.</w:t>
+        <w:t>Error handling and logging are critical components of ensuring the robustness, reliability, and maintainability of your SAP Cloud Platform Integration (SAP CPI) applications. Exception subprocesses play a pivotal role in managing errors that occur during the execution of integration processes, while comprehensive logging provides visibility into the application's behavior and helps in troubleshooting issues.</w:t>
         <w:br/>
         <w:br/>
-        <w:t>In SAP CPI, exceptions are categorized based on their severity and origin. Common exception types include business logic errors, technical errors, and runtime errors. Business logic errors typically arise from incorrect or incomplete configuration settings, while technical errors may stem from issues such as connectivity problems or data validation failures. Runtime errors can occur due to unexpected conditions during the execution of an integration flow.</w:t>
+        <w:t>Exception subprocesses are designed to handle exceptions thrown by service calls or within the flow of an integration process. These subprocesses can be configured at various levels, such as on a process level, on individual steps, or even on specific service invocations. By defining exception handlers, you can ensure that errors are appropriately managed and logged, preventing them from escalating into more severe issues.</w:t>
         <w:br/>
         <w:br/>
-        <w:t>SAP CPI provides a robust framework for managing exceptions through its exception handling capabilities. The `catch` and `finally` blocks are essential constructs used within integration flows to handle exceptions. The `catch` block is designed to catch specific types of exceptions, allowing for targeted error handling logic. For instance, a `catch` block can be configured to log detailed information about an exception or to trigger alternative processing paths. Conversely, the `finally` block ensures that certain actions are executed regardless of whether an exception was thrown, such as closing database connections or releasing resources.</w:t>
+        <w:t>For instance, consider a scenario where an integration process is designed to send data to an external system via a web service call. If the web service returns an error response or if the connection fails, an exception subprocess can be triggered. This subprocess can then log detailed information about the error and take appropriate actions such as retrying the operation, sending alerts to administrators, or rolling back the transaction.</w:t>
         <w:br/>
         <w:br/>
-        <w:t>Logging in SAP CPI is facilitated through the use of the Message Service and the Event Log. The Message Service allows for structured logging, where messages can be enriched with metadata such as timestamps, user IDs</w:t>
+        <w:t>Effective logging is essential for maintaining visibility into the operational state of your integration processes. SAP CPI provides a robust logging mechanism that supports both structured and unstructured logs. Structured logs are particularly useful as they provide a consistent format for log entries, making it easier to parse and analyze them using tools like Log Analysis Services (LAS) or external log management systems.</w:t>
+        <w:br/>
+        <w:br/>
+        <w:t>When configuring logging in SAP CPI, it is important</w:t>
       </w:r>
     </w:p>
     <w:p>
@@ -299,19 +307,19 @@
     </w:p>
     <w:p>
       <w:r>
-        <w:t>Testing validation is a critical phase in the implementation of an SAP Cloud Platform Integration (SAP CPI) solution, ensuring that all components and processes function as intended. The testing strategy should be comprehensive, covering both functional and non-functional aspects to validate the integration's reliability, performance, and security.</w:t>
+        <w:t>Testing validation is a critical phase in the development lifecycle of CPI applications to ensure that components, processes, and interfaces function as expected. In SAP CPI, both unit testing and integration testing are essential practices to validate the correctness and reliability of your application.</w:t>
         <w:br/>
         <w:br/>
-        <w:t>The initial step involves setting up test environments that closely mirror the production environment in terms of hardware, software, and network configurations. This ensures that any issues identified during testing are relevant to the actual deployment scenario. Test data should be carefully managed to avoid sensitive information exposure while still providing realistic scenarios for validation.</w:t>
+        <w:t>Unit testing focuses on verifying individual components or services within an application to ensure they operate correctly under various scenarios. This includes validating the behavior of custom Java code, transformation logic, and service invocations. Unit tests should cover a wide range of test cases, including edge cases and error conditions, ensuring that each component behaves as intended in isolation.</w:t>
         <w:br/>
         <w:br/>
-        <w:t>Functional testing focuses on verifying the correct execution of business processes within SAP CPI. This includes validating the transformation rules, message routing, and service invocation functionalities. Automated test scripts can be developed using tools like SAP CPI’s built-in testing framework or third-party automation tools to ensure consistent and repeatable tests. Integration tests should cover all integration points between different systems, ensuring that data flows accurately and without errors.</w:t>
+        <w:t>Integration testing, on the other hand, is concerned with verifying the interaction between components or services within an application. This involves simulating real-world scenarios where multiple CPI artifacts (such as processes, connectors, and data flows) interact with one another. Integration tests should be designed to validate that data passes correctly through the system, transformations are applied accurately, and external systems are invoked properly.</w:t>
         <w:br/>
         <w:br/>
-        <w:t>Performance testing is essential for assessing the scalability and efficiency of the solution under various load conditions. This involves simulating high volumes of messages and transactions to evaluate system response times, throughput, and resource utilization. Load testing tools such as Apache JMeter or SAP CPI’s built-in performance test capabilities can be utilized to generate realistic workloads.</w:t>
+        <w:t>In SAP CPI, integration testing can be particularly complex due to the numerous components involved in a typical deployment. To facilitate this, SAP provides tools such as the Test Environment Manager (TEM) which allows for the creation of test environments that closely mimic production settings. This enables developers to perform comprehensive integration tests without affecting live systems.</w:t>
         <w:br/>
         <w:br/>
-        <w:t>Security validation is another critical aspect, ensuring that the integration solution complies with organizational security policies and standards. This includes testing authentication mechanisms, encryption protocols, access controls, and data privacy measures</w:t>
+        <w:t>To implement effective testing validation strategies, it is recommended to follow best practices such as writing clear and concise test cases, using mock services where appropriate, and leveraging SAP CPI's built-in testing features like the Test Runner. Additionally</w:t>
       </w:r>
     </w:p>
     <w:p>
@@ -324,22 +332,55 @@
     </w:p>
     <w:p>
       <w:r>
-        <w:t>The section on "Reference Documents" is crucial for ensuring that all stakeholders have access to the necessary information and guidelines required for the successful implementation, maintenance, and support of the SAP Cloud Platform Integration (SAP CPI) solution. This document serves as a central repository for all relevant reference materials, including but not limited to official SAP documentation, technical guides, configuration settings, and best practices.</w:t>
+        <w:t>Reference documents play a crucial role in ensuring that the implementation and maintenance of SAP Cloud Platform Integration (SAP CPI) are carried out according to best practices and industry standards. These documents serve as comprehensive guides, providing detailed information on various aspects of SAP CPI, including its architecture, configuration, and integration scenarios.</w:t>
         <w:br/>
         <w:br/>
-        <w:t>The primary reference documents include:</w:t>
+        <w:t>The official SAP CPI documentation is an essential resource for technical architects, developers, and administrators. It covers a wide range of topics such as the system landscape, deployment models, service-oriented architecture (SOA) principles, and the use of various integration services like Cloud Integration, Cloud Connector, and Message Forwarding Service. The documentation also includes step-by-step guides on setting up environments, configuring services, and troubleshooting common issues.</w:t>
         <w:br/>
         <w:br/>
-        <w:t>1. **SAP CPI Documentation**: This encompasses a wide range of manuals and guides provided by SAP, covering various aspects such as system administration, integration flows, message processors, and adapters. These documents are essential for understanding the architecture, functionality, and configuration options available in SAP CPI.</w:t>
+        <w:t>For instance, the "SAP CPI System Landscape Guide" provides an in-depth look at the different components that make up a SAP CPI environment, including the Integration Server, Message Forwarding Service, and Cloud Connector. This guide is particularly useful for understanding how these components interact with each other and with external systems to facilitate seamless data exchange.</w:t>
         <w:br/>
         <w:br/>
-        <w:t>2. **SAP CPI Best Practices Guide**: This document offers detailed recommendations on how to design, implement, and maintain efficient and secure integration solutions using SAP CPI. It covers topics such as performance optimization, security measures, error handling, and versioning strategies.</w:t>
+        <w:t>The "SAP CPI Development Guide" offers detailed instructions on developing integration flows using the Business Process Model and Notation (BPMN) standard. It covers topics such as designing processes, implementing message transformations, and handling exceptions. This guide is invaluable for developers looking to build robust and scalable integration solutions.</w:t>
         <w:br/>
         <w:br/>
-        <w:t>3. **API Reference Documentation**: For integrations involving external systems or services, the API reference documentation is indispensable. It provides comprehensive details about available APIs, their parameters, response formats, and authentication mechanisms, ensuring seamless communication between SAP CPI and other systems.</w:t>
+        <w:t>Moreover, the "SAP CPI Administration Guide" provides comprehensive information on managing and maintaining SAP CPI environments. It includes best practices for performance</w:t>
+      </w:r>
+    </w:p>
+    <w:p>
+      <w:r>
+        <w:br w:type="page"/>
+      </w:r>
+    </w:p>
+    <w:p>
+      <w:pPr>
+        <w:pStyle w:val="Heading1"/>
+      </w:pPr>
+      <w:r>
+        <w:t>Integration Architecture Diagram</w:t>
+      </w:r>
+    </w:p>
+    <w:p>
+      <w:r>
+        <w:t>Mermaid Diagram (can be rendered externally):</w:t>
+      </w:r>
+    </w:p>
+    <w:p>
+      <w:r>
+        <w:br/>
+        <w:t>flowchart LR</w:t>
+        <w:br/>
+        <w:t xml:space="preserve">    Sender[Sender System]</w:t>
+        <w:br/>
+        <w:t xml:space="preserve">    CPI[SAP CPI iFlow]</w:t>
+        <w:br/>
+        <w:t xml:space="preserve">    Receiver[Receiver System]</w:t>
         <w:br/>
         <w:br/>
-        <w:t>4. **SAP CPI Configuration Settings Guide**: This guide outlines the various configuration options available for different components of SAP CPI, including system settings, integration flows, message processors, and adapters. It is crucial for customizing the solution to meet specific business requirements while adhering to best practices</w:t>
+        <w:t xml:space="preserve">    Sender --&gt;|Adapter| CPI</w:t>
+        <w:br/>
+        <w:t xml:space="preserve">    CPI --&gt;|Adapter| Receiver</w:t>
+        <w:br/>
       </w:r>
     </w:p>
     <w:sectPr>

</xml_diff>